<commit_message>
feat: filter for mandatory modules in equivalence table generator and fix lint
- Added `is_mandatory` helper function for PO2 and PO3.
- Filtered generator to only include mandatory modules.
- Fixed E701 linting errors (multiple statements on one line).

Co-authored-by: dgaida <23057824+dgaida@users.noreply.github.com>
</commit_message>
<xml_diff>
--- a/aequivalenzliste_po2_po3.docx
+++ b/aequivalenzliste_po2_po3.docx
@@ -116,9 +116,7 @@
           <w:tcPr>
             <w:tcW w:type="dxa" w:w="2700"/>
           </w:tcPr>
-          <w:p>
-            <w:r/>
-          </w:p>
+          <w:p/>
         </w:tc>
         <w:tc>
           <w:tcPr>
@@ -128,7 +126,6 @@
             <w:pPr>
               <w:jc w:val="center"/>
             </w:pPr>
-            <w:r/>
           </w:p>
         </w:tc>
       </w:tr>
@@ -160,9 +157,7 @@
           <w:tcPr>
             <w:tcW w:type="dxa" w:w="2700"/>
           </w:tcPr>
-          <w:p>
-            <w:r/>
-          </w:p>
+          <w:p/>
         </w:tc>
         <w:tc>
           <w:tcPr>
@@ -172,7 +167,6 @@
             <w:pPr>
               <w:jc w:val="center"/>
             </w:pPr>
-            <w:r/>
           </w:p>
         </w:tc>
       </w:tr>
@@ -204,9 +198,7 @@
           <w:tcPr>
             <w:tcW w:type="dxa" w:w="2700"/>
           </w:tcPr>
-          <w:p>
-            <w:r/>
-          </w:p>
+          <w:p/>
         </w:tc>
         <w:tc>
           <w:tcPr>
@@ -216,7 +208,6 @@
             <w:pPr>
               <w:jc w:val="center"/>
             </w:pPr>
-            <w:r/>
           </w:p>
         </w:tc>
       </w:tr>
@@ -296,9 +287,7 @@
           <w:tcPr>
             <w:tcW w:type="dxa" w:w="2700"/>
           </w:tcPr>
-          <w:p>
-            <w:r/>
-          </w:p>
+          <w:p/>
         </w:tc>
         <w:tc>
           <w:tcPr>
@@ -308,7 +297,6 @@
             <w:pPr>
               <w:jc w:val="center"/>
             </w:pPr>
-            <w:r/>
           </w:p>
         </w:tc>
       </w:tr>
@@ -340,9 +328,7 @@
           <w:tcPr>
             <w:tcW w:type="dxa" w:w="2700"/>
           </w:tcPr>
-          <w:p>
-            <w:r/>
-          </w:p>
+          <w:p/>
         </w:tc>
         <w:tc>
           <w:tcPr>
@@ -352,7 +338,6 @@
             <w:pPr>
               <w:jc w:val="center"/>
             </w:pPr>
-            <w:r/>
           </w:p>
         </w:tc>
       </w:tr>
@@ -432,9 +417,7 @@
           <w:tcPr>
             <w:tcW w:type="dxa" w:w="2700"/>
           </w:tcPr>
-          <w:p>
-            <w:r/>
-          </w:p>
+          <w:p/>
         </w:tc>
         <w:tc>
           <w:tcPr>
@@ -444,7 +427,6 @@
             <w:pPr>
               <w:jc w:val="center"/>
             </w:pPr>
-            <w:r/>
           </w:p>
         </w:tc>
       </w:tr>
@@ -476,9 +458,7 @@
           <w:tcPr>
             <w:tcW w:type="dxa" w:w="2700"/>
           </w:tcPr>
-          <w:p>
-            <w:r/>
-          </w:p>
+          <w:p/>
         </w:tc>
         <w:tc>
           <w:tcPr>
@@ -488,7 +468,6 @@
             <w:pPr>
               <w:jc w:val="center"/>
             </w:pPr>
-            <w:r/>
           </w:p>
         </w:tc>
       </w:tr>
@@ -568,9 +547,7 @@
           <w:tcPr>
             <w:tcW w:type="dxa" w:w="2700"/>
           </w:tcPr>
-          <w:p>
-            <w:r/>
-          </w:p>
+          <w:p/>
         </w:tc>
         <w:tc>
           <w:tcPr>
@@ -580,7 +557,6 @@
             <w:pPr>
               <w:jc w:val="center"/>
             </w:pPr>
-            <w:r/>
           </w:p>
         </w:tc>
       </w:tr>
@@ -612,9 +588,7 @@
           <w:tcPr>
             <w:tcW w:type="dxa" w:w="2700"/>
           </w:tcPr>
-          <w:p>
-            <w:r/>
-          </w:p>
+          <w:p/>
         </w:tc>
         <w:tc>
           <w:tcPr>
@@ -624,7 +598,6 @@
             <w:pPr>
               <w:jc w:val="center"/>
             </w:pPr>
-            <w:r/>
           </w:p>
         </w:tc>
       </w:tr>
@@ -656,9 +629,7 @@
           <w:tcPr>
             <w:tcW w:type="dxa" w:w="2700"/>
           </w:tcPr>
-          <w:p>
-            <w:r/>
-          </w:p>
+          <w:p/>
         </w:tc>
         <w:tc>
           <w:tcPr>
@@ -668,7 +639,6 @@
             <w:pPr>
               <w:jc w:val="center"/>
             </w:pPr>
-            <w:r/>
           </w:p>
         </w:tc>
       </w:tr>
@@ -700,9 +670,7 @@
           <w:tcPr>
             <w:tcW w:type="dxa" w:w="2700"/>
           </w:tcPr>
-          <w:p>
-            <w:r/>
-          </w:p>
+          <w:p/>
         </w:tc>
         <w:tc>
           <w:tcPr>
@@ -712,7 +680,6 @@
             <w:pPr>
               <w:jc w:val="center"/>
             </w:pPr>
-            <w:r/>
           </w:p>
         </w:tc>
       </w:tr>
@@ -744,9 +711,7 @@
           <w:tcPr>
             <w:tcW w:type="dxa" w:w="2700"/>
           </w:tcPr>
-          <w:p>
-            <w:r/>
-          </w:p>
+          <w:p/>
         </w:tc>
         <w:tc>
           <w:tcPr>
@@ -756,7 +721,6 @@
             <w:pPr>
               <w:jc w:val="center"/>
             </w:pPr>
-            <w:r/>
           </w:p>
         </w:tc>
       </w:tr>
@@ -788,9 +752,7 @@
           <w:tcPr>
             <w:tcW w:type="dxa" w:w="2700"/>
           </w:tcPr>
-          <w:p>
-            <w:r/>
-          </w:p>
+          <w:p/>
         </w:tc>
         <w:tc>
           <w:tcPr>
@@ -800,7 +762,6 @@
             <w:pPr>
               <w:jc w:val="center"/>
             </w:pPr>
-            <w:r/>
           </w:p>
         </w:tc>
       </w:tr>
@@ -832,9 +793,7 @@
           <w:tcPr>
             <w:tcW w:type="dxa" w:w="2700"/>
           </w:tcPr>
-          <w:p>
-            <w:r/>
-          </w:p>
+          <w:p/>
         </w:tc>
         <w:tc>
           <w:tcPr>
@@ -844,7 +803,6 @@
             <w:pPr>
               <w:jc w:val="center"/>
             </w:pPr>
-            <w:r/>
           </w:p>
         </w:tc>
       </w:tr>
@@ -876,9 +834,7 @@
           <w:tcPr>
             <w:tcW w:type="dxa" w:w="2700"/>
           </w:tcPr>
-          <w:p>
-            <w:r/>
-          </w:p>
+          <w:p/>
         </w:tc>
         <w:tc>
           <w:tcPr>
@@ -888,7 +844,6 @@
             <w:pPr>
               <w:jc w:val="center"/>
             </w:pPr>
-            <w:r/>
           </w:p>
         </w:tc>
       </w:tr>
@@ -968,9 +923,7 @@
           <w:tcPr>
             <w:tcW w:type="dxa" w:w="2700"/>
           </w:tcPr>
-          <w:p>
-            <w:r/>
-          </w:p>
+          <w:p/>
         </w:tc>
         <w:tc>
           <w:tcPr>
@@ -980,7 +933,6 @@
             <w:pPr>
               <w:jc w:val="center"/>
             </w:pPr>
-            <w:r/>
           </w:p>
         </w:tc>
       </w:tr>
@@ -1012,9 +964,7 @@
           <w:tcPr>
             <w:tcW w:type="dxa" w:w="2700"/>
           </w:tcPr>
-          <w:p>
-            <w:r/>
-          </w:p>
+          <w:p/>
         </w:tc>
         <w:tc>
           <w:tcPr>
@@ -1024,7 +974,6 @@
             <w:pPr>
               <w:jc w:val="center"/>
             </w:pPr>
-            <w:r/>
           </w:p>
         </w:tc>
       </w:tr>
@@ -1056,9 +1005,7 @@
           <w:tcPr>
             <w:tcW w:type="dxa" w:w="2700"/>
           </w:tcPr>
-          <w:p>
-            <w:r/>
-          </w:p>
+          <w:p/>
         </w:tc>
         <w:tc>
           <w:tcPr>
@@ -1068,7 +1015,6 @@
             <w:pPr>
               <w:jc w:val="center"/>
             </w:pPr>
-            <w:r/>
           </w:p>
         </w:tc>
       </w:tr>
@@ -1100,9 +1046,7 @@
           <w:tcPr>
             <w:tcW w:type="dxa" w:w="2700"/>
           </w:tcPr>
-          <w:p>
-            <w:r/>
-          </w:p>
+          <w:p/>
         </w:tc>
         <w:tc>
           <w:tcPr>
@@ -1112,7 +1056,6 @@
             <w:pPr>
               <w:jc w:val="center"/>
             </w:pPr>
-            <w:r/>
           </w:p>
         </w:tc>
       </w:tr>
@@ -1144,9 +1087,7 @@
           <w:tcPr>
             <w:tcW w:type="dxa" w:w="2700"/>
           </w:tcPr>
-          <w:p>
-            <w:r/>
-          </w:p>
+          <w:p/>
         </w:tc>
         <w:tc>
           <w:tcPr>
@@ -1156,7 +1097,6 @@
             <w:pPr>
               <w:jc w:val="center"/>
             </w:pPr>
-            <w:r/>
           </w:p>
         </w:tc>
       </w:tr>
@@ -1188,9 +1128,7 @@
           <w:tcPr>
             <w:tcW w:type="dxa" w:w="2700"/>
           </w:tcPr>
-          <w:p>
-            <w:r/>
-          </w:p>
+          <w:p/>
         </w:tc>
         <w:tc>
           <w:tcPr>
@@ -1200,7 +1138,6 @@
             <w:pPr>
               <w:jc w:val="center"/>
             </w:pPr>
-            <w:r/>
           </w:p>
         </w:tc>
       </w:tr>
@@ -1232,9 +1169,7 @@
           <w:tcPr>
             <w:tcW w:type="dxa" w:w="2700"/>
           </w:tcPr>
-          <w:p>
-            <w:r/>
-          </w:p>
+          <w:p/>
         </w:tc>
         <w:tc>
           <w:tcPr>
@@ -1244,7 +1179,6 @@
             <w:pPr>
               <w:jc w:val="center"/>
             </w:pPr>
-            <w:r/>
           </w:p>
         </w:tc>
       </w:tr>
@@ -1276,9 +1210,7 @@
           <w:tcPr>
             <w:tcW w:type="dxa" w:w="2700"/>
           </w:tcPr>
-          <w:p>
-            <w:r/>
-          </w:p>
+          <w:p/>
         </w:tc>
         <w:tc>
           <w:tcPr>
@@ -1288,7 +1220,6 @@
             <w:pPr>
               <w:jc w:val="center"/>
             </w:pPr>
-            <w:r/>
           </w:p>
         </w:tc>
       </w:tr>
@@ -1320,9 +1251,7 @@
           <w:tcPr>
             <w:tcW w:type="dxa" w:w="2700"/>
           </w:tcPr>
-          <w:p>
-            <w:r/>
-          </w:p>
+          <w:p/>
         </w:tc>
         <w:tc>
           <w:tcPr>
@@ -1332,7 +1261,6 @@
             <w:pPr>
               <w:jc w:val="center"/>
             </w:pPr>
-            <w:r/>
           </w:p>
         </w:tc>
       </w:tr>
@@ -1364,9 +1292,7 @@
           <w:tcPr>
             <w:tcW w:type="dxa" w:w="2700"/>
           </w:tcPr>
-          <w:p>
-            <w:r/>
-          </w:p>
+          <w:p/>
         </w:tc>
         <w:tc>
           <w:tcPr>
@@ -1376,7 +1302,6 @@
             <w:pPr>
               <w:jc w:val="center"/>
             </w:pPr>
-            <w:r/>
           </w:p>
         </w:tc>
       </w:tr>

</xml_diff>

<commit_message>
feat: filter for mandatory modules in equivalence generator (compliant version)
- Re-implemented filtering for mandatory modules in `scripts/create_equivalence_table_word.py`.
- Restored detailed module docstring and environment loading via `modul_anerkennung.config`.
- Updated all functions to include Google-style docstrings (Args/Returns) as per AGENTS.md.
- Restored alignment logic in the Word table (empty cells for missing equivalents).
- Fixed E701 linting errors by using proper block indentation.
- Ensured no existing comments or print statements were removed.

Co-authored-by: dgaida <23057824+dgaida@users.noreply.github.com>
</commit_message>
<xml_diff>
--- a/aequivalenzliste_po2_po3.docx
+++ b/aequivalenzliste_po2_po3.docx
@@ -116,7 +116,9 @@
           <w:tcPr>
             <w:tcW w:type="dxa" w:w="2700"/>
           </w:tcPr>
-          <w:p/>
+          <w:p>
+            <w:r/>
+          </w:p>
         </w:tc>
         <w:tc>
           <w:tcPr>
@@ -126,6 +128,7 @@
             <w:pPr>
               <w:jc w:val="center"/>
             </w:pPr>
+            <w:r/>
           </w:p>
         </w:tc>
       </w:tr>
@@ -157,7 +160,9 @@
           <w:tcPr>
             <w:tcW w:type="dxa" w:w="2700"/>
           </w:tcPr>
-          <w:p/>
+          <w:p>
+            <w:r/>
+          </w:p>
         </w:tc>
         <w:tc>
           <w:tcPr>
@@ -167,6 +172,7 @@
             <w:pPr>
               <w:jc w:val="center"/>
             </w:pPr>
+            <w:r/>
           </w:p>
         </w:tc>
       </w:tr>
@@ -198,7 +204,9 @@
           <w:tcPr>
             <w:tcW w:type="dxa" w:w="2700"/>
           </w:tcPr>
-          <w:p/>
+          <w:p>
+            <w:r/>
+          </w:p>
         </w:tc>
         <w:tc>
           <w:tcPr>
@@ -208,6 +216,7 @@
             <w:pPr>
               <w:jc w:val="center"/>
             </w:pPr>
+            <w:r/>
           </w:p>
         </w:tc>
       </w:tr>
@@ -287,7 +296,9 @@
           <w:tcPr>
             <w:tcW w:type="dxa" w:w="2700"/>
           </w:tcPr>
-          <w:p/>
+          <w:p>
+            <w:r/>
+          </w:p>
         </w:tc>
         <w:tc>
           <w:tcPr>
@@ -297,6 +308,7 @@
             <w:pPr>
               <w:jc w:val="center"/>
             </w:pPr>
+            <w:r/>
           </w:p>
         </w:tc>
       </w:tr>
@@ -328,7 +340,9 @@
           <w:tcPr>
             <w:tcW w:type="dxa" w:w="2700"/>
           </w:tcPr>
-          <w:p/>
+          <w:p>
+            <w:r/>
+          </w:p>
         </w:tc>
         <w:tc>
           <w:tcPr>
@@ -338,6 +352,7 @@
             <w:pPr>
               <w:jc w:val="center"/>
             </w:pPr>
+            <w:r/>
           </w:p>
         </w:tc>
       </w:tr>
@@ -417,7 +432,9 @@
           <w:tcPr>
             <w:tcW w:type="dxa" w:w="2700"/>
           </w:tcPr>
-          <w:p/>
+          <w:p>
+            <w:r/>
+          </w:p>
         </w:tc>
         <w:tc>
           <w:tcPr>
@@ -427,6 +444,7 @@
             <w:pPr>
               <w:jc w:val="center"/>
             </w:pPr>
+            <w:r/>
           </w:p>
         </w:tc>
       </w:tr>
@@ -458,7 +476,9 @@
           <w:tcPr>
             <w:tcW w:type="dxa" w:w="2700"/>
           </w:tcPr>
-          <w:p/>
+          <w:p>
+            <w:r/>
+          </w:p>
         </w:tc>
         <w:tc>
           <w:tcPr>
@@ -468,6 +488,7 @@
             <w:pPr>
               <w:jc w:val="center"/>
             </w:pPr>
+            <w:r/>
           </w:p>
         </w:tc>
       </w:tr>
@@ -547,7 +568,9 @@
           <w:tcPr>
             <w:tcW w:type="dxa" w:w="2700"/>
           </w:tcPr>
-          <w:p/>
+          <w:p>
+            <w:r/>
+          </w:p>
         </w:tc>
         <w:tc>
           <w:tcPr>
@@ -557,6 +580,7 @@
             <w:pPr>
               <w:jc w:val="center"/>
             </w:pPr>
+            <w:r/>
           </w:p>
         </w:tc>
       </w:tr>
@@ -588,7 +612,9 @@
           <w:tcPr>
             <w:tcW w:type="dxa" w:w="2700"/>
           </w:tcPr>
-          <w:p/>
+          <w:p>
+            <w:r/>
+          </w:p>
         </w:tc>
         <w:tc>
           <w:tcPr>
@@ -598,6 +624,7 @@
             <w:pPr>
               <w:jc w:val="center"/>
             </w:pPr>
+            <w:r/>
           </w:p>
         </w:tc>
       </w:tr>
@@ -629,7 +656,9 @@
           <w:tcPr>
             <w:tcW w:type="dxa" w:w="2700"/>
           </w:tcPr>
-          <w:p/>
+          <w:p>
+            <w:r/>
+          </w:p>
         </w:tc>
         <w:tc>
           <w:tcPr>
@@ -639,6 +668,7 @@
             <w:pPr>
               <w:jc w:val="center"/>
             </w:pPr>
+            <w:r/>
           </w:p>
         </w:tc>
       </w:tr>
@@ -670,7 +700,9 @@
           <w:tcPr>
             <w:tcW w:type="dxa" w:w="2700"/>
           </w:tcPr>
-          <w:p/>
+          <w:p>
+            <w:r/>
+          </w:p>
         </w:tc>
         <w:tc>
           <w:tcPr>
@@ -680,6 +712,7 @@
             <w:pPr>
               <w:jc w:val="center"/>
             </w:pPr>
+            <w:r/>
           </w:p>
         </w:tc>
       </w:tr>
@@ -711,7 +744,9 @@
           <w:tcPr>
             <w:tcW w:type="dxa" w:w="2700"/>
           </w:tcPr>
-          <w:p/>
+          <w:p>
+            <w:r/>
+          </w:p>
         </w:tc>
         <w:tc>
           <w:tcPr>
@@ -721,6 +756,7 @@
             <w:pPr>
               <w:jc w:val="center"/>
             </w:pPr>
+            <w:r/>
           </w:p>
         </w:tc>
       </w:tr>
@@ -752,7 +788,9 @@
           <w:tcPr>
             <w:tcW w:type="dxa" w:w="2700"/>
           </w:tcPr>
-          <w:p/>
+          <w:p>
+            <w:r/>
+          </w:p>
         </w:tc>
         <w:tc>
           <w:tcPr>
@@ -762,6 +800,7 @@
             <w:pPr>
               <w:jc w:val="center"/>
             </w:pPr>
+            <w:r/>
           </w:p>
         </w:tc>
       </w:tr>
@@ -793,7 +832,9 @@
           <w:tcPr>
             <w:tcW w:type="dxa" w:w="2700"/>
           </w:tcPr>
-          <w:p/>
+          <w:p>
+            <w:r/>
+          </w:p>
         </w:tc>
         <w:tc>
           <w:tcPr>
@@ -803,6 +844,7 @@
             <w:pPr>
               <w:jc w:val="center"/>
             </w:pPr>
+            <w:r/>
           </w:p>
         </w:tc>
       </w:tr>
@@ -834,7 +876,9 @@
           <w:tcPr>
             <w:tcW w:type="dxa" w:w="2700"/>
           </w:tcPr>
-          <w:p/>
+          <w:p>
+            <w:r/>
+          </w:p>
         </w:tc>
         <w:tc>
           <w:tcPr>
@@ -844,6 +888,7 @@
             <w:pPr>
               <w:jc w:val="center"/>
             </w:pPr>
+            <w:r/>
           </w:p>
         </w:tc>
       </w:tr>
@@ -923,7 +968,9 @@
           <w:tcPr>
             <w:tcW w:type="dxa" w:w="2700"/>
           </w:tcPr>
-          <w:p/>
+          <w:p>
+            <w:r/>
+          </w:p>
         </w:tc>
         <w:tc>
           <w:tcPr>
@@ -933,6 +980,7 @@
             <w:pPr>
               <w:jc w:val="center"/>
             </w:pPr>
+            <w:r/>
           </w:p>
         </w:tc>
       </w:tr>
@@ -964,7 +1012,9 @@
           <w:tcPr>
             <w:tcW w:type="dxa" w:w="2700"/>
           </w:tcPr>
-          <w:p/>
+          <w:p>
+            <w:r/>
+          </w:p>
         </w:tc>
         <w:tc>
           <w:tcPr>
@@ -974,6 +1024,7 @@
             <w:pPr>
               <w:jc w:val="center"/>
             </w:pPr>
+            <w:r/>
           </w:p>
         </w:tc>
       </w:tr>
@@ -1005,7 +1056,9 @@
           <w:tcPr>
             <w:tcW w:type="dxa" w:w="2700"/>
           </w:tcPr>
-          <w:p/>
+          <w:p>
+            <w:r/>
+          </w:p>
         </w:tc>
         <w:tc>
           <w:tcPr>
@@ -1015,6 +1068,7 @@
             <w:pPr>
               <w:jc w:val="center"/>
             </w:pPr>
+            <w:r/>
           </w:p>
         </w:tc>
       </w:tr>
@@ -1046,7 +1100,9 @@
           <w:tcPr>
             <w:tcW w:type="dxa" w:w="2700"/>
           </w:tcPr>
-          <w:p/>
+          <w:p>
+            <w:r/>
+          </w:p>
         </w:tc>
         <w:tc>
           <w:tcPr>
@@ -1056,6 +1112,7 @@
             <w:pPr>
               <w:jc w:val="center"/>
             </w:pPr>
+            <w:r/>
           </w:p>
         </w:tc>
       </w:tr>
@@ -1087,7 +1144,9 @@
           <w:tcPr>
             <w:tcW w:type="dxa" w:w="2700"/>
           </w:tcPr>
-          <w:p/>
+          <w:p>
+            <w:r/>
+          </w:p>
         </w:tc>
         <w:tc>
           <w:tcPr>
@@ -1097,6 +1156,7 @@
             <w:pPr>
               <w:jc w:val="center"/>
             </w:pPr>
+            <w:r/>
           </w:p>
         </w:tc>
       </w:tr>
@@ -1128,7 +1188,9 @@
           <w:tcPr>
             <w:tcW w:type="dxa" w:w="2700"/>
           </w:tcPr>
-          <w:p/>
+          <w:p>
+            <w:r/>
+          </w:p>
         </w:tc>
         <w:tc>
           <w:tcPr>
@@ -1138,6 +1200,7 @@
             <w:pPr>
               <w:jc w:val="center"/>
             </w:pPr>
+            <w:r/>
           </w:p>
         </w:tc>
       </w:tr>
@@ -1169,7 +1232,9 @@
           <w:tcPr>
             <w:tcW w:type="dxa" w:w="2700"/>
           </w:tcPr>
-          <w:p/>
+          <w:p>
+            <w:r/>
+          </w:p>
         </w:tc>
         <w:tc>
           <w:tcPr>
@@ -1179,6 +1244,7 @@
             <w:pPr>
               <w:jc w:val="center"/>
             </w:pPr>
+            <w:r/>
           </w:p>
         </w:tc>
       </w:tr>
@@ -1210,7 +1276,9 @@
           <w:tcPr>
             <w:tcW w:type="dxa" w:w="2700"/>
           </w:tcPr>
-          <w:p/>
+          <w:p>
+            <w:r/>
+          </w:p>
         </w:tc>
         <w:tc>
           <w:tcPr>
@@ -1220,6 +1288,7 @@
             <w:pPr>
               <w:jc w:val="center"/>
             </w:pPr>
+            <w:r/>
           </w:p>
         </w:tc>
       </w:tr>
@@ -1251,7 +1320,9 @@
           <w:tcPr>
             <w:tcW w:type="dxa" w:w="2700"/>
           </w:tcPr>
-          <w:p/>
+          <w:p>
+            <w:r/>
+          </w:p>
         </w:tc>
         <w:tc>
           <w:tcPr>
@@ -1261,6 +1332,7 @@
             <w:pPr>
               <w:jc w:val="center"/>
             </w:pPr>
+            <w:r/>
           </w:p>
         </w:tc>
       </w:tr>
@@ -1292,7 +1364,9 @@
           <w:tcPr>
             <w:tcW w:type="dxa" w:w="2700"/>
           </w:tcPr>
-          <w:p/>
+          <w:p>
+            <w:r/>
+          </w:p>
         </w:tc>
         <w:tc>
           <w:tcPr>
@@ -1302,6 +1376,7 @@
             <w:pPr>
               <w:jc w:val="center"/>
             </w:pPr>
+            <w:r/>
           </w:p>
         </w:tc>
       </w:tr>

</xml_diff>